<commit_message>
alteração e adição das telas
</commit_message>
<xml_diff>
--- a/Documentação/Telas/Tela de Manutenção preventiva.docx
+++ b/Documentação/Telas/Tela de Manutenção preventiva.docx
@@ -8,70 +8,107 @@
         <w:bidi w:val="0"/>
         <w:spacing w:lineRule="auto" w:line="276" w:before="0" w:after="140"/>
         <w:jc w:val="start"/>
-        <w:rPr/>
-      </w:pPr>
-      <w:r>
-        <w:rPr/>
-        <w:t>Detalhamento de Tela: Manutenção Preventiva</w:t>
-      </w:r>
-    </w:p>
-    <w:p>
-      <w:pPr>
-        <w:pStyle w:val="BodyText"/>
-        <w:bidi w:val="0"/>
-        <w:jc w:val="start"/>
-        <w:rPr/>
-      </w:pPr>
-      <w:r>
-        <w:rPr/>
-        <w:t xml:space="preserve">A tela de </w:t>
-      </w:r>
-      <w:r>
-        <w:rPr>
-          <w:rStyle w:val="Strong"/>
-        </w:rPr>
-        <w:t>Manutenção Preventiva</w:t>
-      </w:r>
-      <w:r>
-        <w:rPr/>
-        <w:t xml:space="preserve"> transforma os dados de quilometragem anotados no Dashboard em inteligência para o cuidado com o veículo. Ela atua como um sistema de alertas antecipados, evitando quebras inesperadas e gastos elevados com manutenção corretiva.</w:t>
+        <w:rPr>
+          <w:sz w:val="24"/>
+          <w:szCs w:val="24"/>
+        </w:rPr>
+      </w:pPr>
+      <w:r>
+        <w:rPr>
+          <w:sz w:val="24"/>
+          <w:szCs w:val="24"/>
+        </w:rPr>
+        <w:t xml:space="preserve">🛠️ </w:t>
+      </w:r>
+      <w:r>
+        <w:rPr>
+          <w:sz w:val="24"/>
+          <w:szCs w:val="24"/>
+        </w:rPr>
+        <w:t>Detalhamento de Tela: Oficina (Manutenção Preventiva)</w:t>
+      </w:r>
+    </w:p>
+    <w:p>
+      <w:pPr>
+        <w:pStyle w:val="BodyText"/>
+        <w:rPr/>
+      </w:pPr>
+      <w:r>
+        <w:rPr/>
+        <w:t xml:space="preserve">A tela de Oficina é o centro de diagnóstico e cuidado com a frota no </w:t>
+      </w:r>
+      <w:r>
+        <w:rPr>
+          <w:rStyle w:val="Strong"/>
+        </w:rPr>
+        <w:t>MeuCorre</w:t>
+      </w:r>
+      <w:r>
+        <w:rPr/>
+        <w:t>. Ela permite monitorizar o desgaste de componentes, registar manutenções realizadas e configurar novos alertas, garantindo a segurança e a economia do piloto.</w:t>
       </w:r>
     </w:p>
     <w:p>
       <w:pPr>
         <w:pStyle w:val="Heading2"/>
-        <w:bidi w:val="0"/>
         <w:spacing w:lineRule="auto" w:line="276" w:before="0" w:after="140"/>
-        <w:jc w:val="start"/>
-        <w:rPr/>
-      </w:pPr>
-      <w:r>
-        <w:rPr/>
+        <w:rPr>
+          <w:sz w:val="24"/>
+          <w:szCs w:val="24"/>
+        </w:rPr>
+      </w:pPr>
+      <w:r>
+        <w:rPr>
+          <w:sz w:val="24"/>
+          <w:szCs w:val="24"/>
+        </w:rPr>
         <w:t>1. Interface e Layout (UI/UX)</w:t>
       </w:r>
     </w:p>
     <w:p>
       <w:pPr>
         <w:pStyle w:val="BodyText"/>
-        <w:bidi w:val="0"/>
-        <w:jc w:val="start"/>
-        <w:rPr/>
-      </w:pPr>
-      <w:r>
-        <w:rPr/>
-        <w:t>O design foca na visualização rápida do "grau de urgência" de cada componente da moto.</w:t>
+        <w:rPr/>
+      </w:pPr>
+      <w:r>
+        <w:rPr/>
+        <w:t xml:space="preserve">O design foca-se no </w:t>
+      </w:r>
+      <w:r>
+        <w:rPr>
+          <w:rStyle w:val="Strong"/>
+        </w:rPr>
+        <w:t>Estado de Desgaste</w:t>
+      </w:r>
+      <w:r>
+        <w:rPr/>
+        <w:t xml:space="preserve"> e na </w:t>
+      </w:r>
+      <w:r>
+        <w:rPr>
+          <w:rStyle w:val="Strong"/>
+        </w:rPr>
+        <w:t>Rapidez de Consulta</w:t>
+      </w:r>
+      <w:r>
+        <w:rPr/>
+        <w:t>, utilizando barras de progresso que indicam o consumo da vida útil das peças.</w:t>
       </w:r>
     </w:p>
     <w:p>
       <w:pPr>
         <w:pStyle w:val="Heading3"/>
-        <w:bidi w:val="0"/>
         <w:spacing w:lineRule="auto" w:line="276" w:before="0" w:after="140"/>
-        <w:jc w:val="start"/>
-        <w:rPr/>
-      </w:pPr>
-      <w:r>
-        <w:rPr/>
+        <w:rPr>
+          <w:sz w:val="24"/>
+          <w:szCs w:val="24"/>
+        </w:rPr>
+      </w:pPr>
+      <w:r>
+        <w:rPr>
+          <w:sz w:val="24"/>
+          <w:szCs w:val="24"/>
+        </w:rPr>
         <w:t>1.1. Estrutura Visual</w:t>
       </w:r>
     </w:p>
@@ -84,22 +121,91 @@
         </w:numPr>
         <w:tabs>
           <w:tab w:val="clear" w:pos="709"/>
-          <w:tab w:val="left" w:pos="709" w:leader="none"/>
-        </w:tabs>
-        <w:bidi w:val="0"/>
+          <w:tab w:val="left" w:pos="0" w:leader="none"/>
+        </w:tabs>
         <w:ind w:hanging="283" w:start="709"/>
-        <w:jc w:val="start"/>
-        <w:rPr/>
-      </w:pPr>
-      <w:r>
-        <w:rPr>
-          <w:rStyle w:val="Strong"/>
-        </w:rPr>
-        <w:t>Status Geral:</w:t>
-      </w:r>
-      <w:r>
-        <w:rPr/>
-        <w:t xml:space="preserve"> Um indicador no topo que resume a situação da moto (ex: "Sua moto está em dia" ou "Atenção: 2 itens pendentes").</w:t>
+        <w:rPr/>
+      </w:pPr>
+      <w:r>
+        <w:rPr>
+          <w:rStyle w:val="Strong"/>
+        </w:rPr>
+        <w:t>Cabeçalho Funcional:</w:t>
+      </w:r>
+    </w:p>
+    <w:p>
+      <w:pPr>
+        <w:pStyle w:val="BodyText"/>
+        <w:numPr>
+          <w:ilvl w:val="1"/>
+          <w:numId w:val="1"/>
+        </w:numPr>
+        <w:tabs>
+          <w:tab w:val="clear" w:pos="709"/>
+          <w:tab w:val="left" w:pos="0" w:leader="none"/>
+        </w:tabs>
+        <w:ind w:hanging="283" w:start="1418"/>
+        <w:rPr/>
+      </w:pPr>
+      <w:r>
+        <w:rPr>
+          <w:rStyle w:val="Strong"/>
+        </w:rPr>
+        <w:t>Botão Voltar:</w:t>
+      </w:r>
+      <w:r>
+        <w:rPr/>
+        <w:t xml:space="preserve"> Retorna ao ecrã anterior.</w:t>
+      </w:r>
+    </w:p>
+    <w:p>
+      <w:pPr>
+        <w:pStyle w:val="BodyText"/>
+        <w:numPr>
+          <w:ilvl w:val="1"/>
+          <w:numId w:val="1"/>
+        </w:numPr>
+        <w:tabs>
+          <w:tab w:val="clear" w:pos="709"/>
+          <w:tab w:val="left" w:pos="0" w:leader="none"/>
+        </w:tabs>
+        <w:ind w:hanging="283" w:start="1418"/>
+        <w:rPr/>
+      </w:pPr>
+      <w:r>
+        <w:rPr>
+          <w:rStyle w:val="Strong"/>
+        </w:rPr>
+        <w:t>Título:</w:t>
+      </w:r>
+      <w:r>
+        <w:rPr/>
+        <w:t xml:space="preserve"> "Oficina".</w:t>
+      </w:r>
+    </w:p>
+    <w:p>
+      <w:pPr>
+        <w:pStyle w:val="BodyText"/>
+        <w:numPr>
+          <w:ilvl w:val="1"/>
+          <w:numId w:val="1"/>
+        </w:numPr>
+        <w:tabs>
+          <w:tab w:val="clear" w:pos="709"/>
+          <w:tab w:val="left" w:pos="0" w:leader="none"/>
+        </w:tabs>
+        <w:ind w:hanging="283" w:start="1418"/>
+        <w:rPr/>
+      </w:pPr>
+      <w:r>
+        <w:rPr>
+          <w:rStyle w:val="Strong"/>
+        </w:rPr>
+        <w:t>Botão [+] (Adicionar):</w:t>
+      </w:r>
+      <w:r>
+        <w:rPr/>
+        <w:t xml:space="preserve"> Abre o modal para criar um novo tipo de manutenção.</w:t>
       </w:r>
     </w:p>
     <w:p>
@@ -111,18 +217,16 @@
         </w:numPr>
         <w:tabs>
           <w:tab w:val="clear" w:pos="709"/>
-          <w:tab w:val="left" w:pos="709" w:leader="none"/>
-        </w:tabs>
-        <w:bidi w:val="0"/>
+          <w:tab w:val="left" w:pos="0" w:leader="none"/>
+        </w:tabs>
         <w:ind w:hanging="283" w:start="709"/>
-        <w:jc w:val="start"/>
-        <w:rPr/>
-      </w:pPr>
-      <w:r>
-        <w:rPr>
-          <w:rStyle w:val="Strong"/>
-        </w:rPr>
-        <w:t>Cards de Progresso (Componentes):</w:t>
+        <w:rPr/>
+      </w:pPr>
+      <w:r>
+        <w:rPr>
+          <w:rStyle w:val="Strong"/>
+        </w:rPr>
+        <w:t>Card de Consulta de Veículo:</w:t>
       </w:r>
     </w:p>
     <w:p>
@@ -134,16 +238,14 @@
         </w:numPr>
         <w:tabs>
           <w:tab w:val="clear" w:pos="709"/>
-          <w:tab w:val="left" w:pos="1418" w:leader="none"/>
-        </w:tabs>
-        <w:bidi w:val="0"/>
+          <w:tab w:val="left" w:pos="0" w:leader="none"/>
+        </w:tabs>
         <w:ind w:hanging="283" w:start="1418"/>
-        <w:jc w:val="start"/>
-        <w:rPr/>
-      </w:pPr>
-      <w:r>
-        <w:rPr/>
-        <w:t>Cada card representa um item (Óleo, Pneus, Relação, Pastilhas, Velas).</w:t>
+        <w:rPr/>
+      </w:pPr>
+      <w:r>
+        <w:rPr/>
+        <w:t>Exibe o veículo que está a ser analisado no momento (Marca, Modelo, Placa).</w:t>
       </w:r>
     </w:p>
     <w:p>
@@ -155,22 +257,120 @@
         </w:numPr>
         <w:tabs>
           <w:tab w:val="clear" w:pos="709"/>
-          <w:tab w:val="left" w:pos="1418" w:leader="none"/>
-        </w:tabs>
-        <w:bidi w:val="0"/>
+          <w:tab w:val="left" w:pos="0" w:leader="none"/>
+        </w:tabs>
         <w:ind w:hanging="283" w:start="1418"/>
-        <w:jc w:val="start"/>
-        <w:rPr/>
-      </w:pPr>
-      <w:r>
-        <w:rPr>
-          <w:rStyle w:val="Strong"/>
-        </w:rPr>
-        <w:t>Barra de Progresso:</w:t>
-      </w:r>
-      <w:r>
-        <w:rPr/>
-        <w:t xml:space="preserve"> Uma barra horizontal que preenche conforme a quilometragem avança.</w:t>
+        <w:rPr/>
+      </w:pPr>
+      <w:r>
+        <w:rPr>
+          <w:rStyle w:val="Strong"/>
+        </w:rPr>
+        <w:t>Seletor Lateral:</w:t>
+      </w:r>
+      <w:r>
+        <w:rPr/>
+        <w:t xml:space="preserve"> Ícone de seta para baixo que abre uma lista de frota para alternar a consulta sem mudar o veículo ativo no Dashboard.</w:t>
+      </w:r>
+    </w:p>
+    <w:p>
+      <w:pPr>
+        <w:pStyle w:val="BodyText"/>
+        <w:numPr>
+          <w:ilvl w:val="1"/>
+          <w:numId w:val="1"/>
+        </w:numPr>
+        <w:tabs>
+          <w:tab w:val="clear" w:pos="709"/>
+          <w:tab w:val="left" w:pos="0" w:leader="none"/>
+        </w:tabs>
+        <w:ind w:hanging="283" w:start="1418"/>
+        <w:rPr/>
+      </w:pPr>
+      <w:r>
+        <w:rPr>
+          <w:rStyle w:val="Strong"/>
+        </w:rPr>
+        <w:t>Bloco de Dados:</w:t>
+      </w:r>
+      <w:r>
+        <w:rPr/>
+        <w:t xml:space="preserve"> KM atual registado e indicação de </w:t>
+      </w:r>
+      <w:r>
+        <w:rPr>
+          <w:rStyle w:val="Strong"/>
+        </w:rPr>
+        <w:t>Saúde Geral (%)</w:t>
+      </w:r>
+      <w:r>
+        <w:rPr/>
+        <w:t>.</w:t>
+      </w:r>
+    </w:p>
+    <w:p>
+      <w:pPr>
+        <w:pStyle w:val="BodyText"/>
+        <w:numPr>
+          <w:ilvl w:val="1"/>
+          <w:numId w:val="1"/>
+        </w:numPr>
+        <w:tabs>
+          <w:tab w:val="clear" w:pos="709"/>
+          <w:tab w:val="left" w:pos="0" w:leader="none"/>
+        </w:tabs>
+        <w:ind w:hanging="283" w:start="1418"/>
+        <w:rPr/>
+      </w:pPr>
+      <w:r>
+        <w:rPr>
+          <w:rStyle w:val="Strong"/>
+        </w:rPr>
+        <w:t>Indicador de Pendências:</w:t>
+      </w:r>
+      <w:r>
+        <w:rPr/>
+        <w:t xml:space="preserve"> Badge dinâmica ao lado da saúde (Ex: "Tudo OK" 🟢 ou "2 itens pendentes" 🔴).</w:t>
+      </w:r>
+    </w:p>
+    <w:p>
+      <w:pPr>
+        <w:pStyle w:val="BodyText"/>
+        <w:numPr>
+          <w:ilvl w:val="0"/>
+          <w:numId w:val="1"/>
+        </w:numPr>
+        <w:tabs>
+          <w:tab w:val="clear" w:pos="709"/>
+          <w:tab w:val="left" w:pos="0" w:leader="none"/>
+        </w:tabs>
+        <w:ind w:hanging="283" w:start="709"/>
+        <w:rPr/>
+      </w:pPr>
+      <w:r>
+        <w:rPr>
+          <w:rStyle w:val="Strong"/>
+        </w:rPr>
+        <w:t>Lista de Componentes (Cards Dinâmicos):</w:t>
+      </w:r>
+    </w:p>
+    <w:p>
+      <w:pPr>
+        <w:pStyle w:val="BodyText"/>
+        <w:numPr>
+          <w:ilvl w:val="1"/>
+          <w:numId w:val="1"/>
+        </w:numPr>
+        <w:tabs>
+          <w:tab w:val="clear" w:pos="709"/>
+          <w:tab w:val="left" w:pos="0" w:leader="none"/>
+        </w:tabs>
+        <w:ind w:hanging="283" w:start="1418"/>
+        <w:rPr/>
+      </w:pPr>
+      <w:r>
+        <w:rPr/>
+        <w:t>Cada card contém:</w:t>
       </w:r>
     </w:p>
     <w:p>
@@ -182,22 +382,20 @@
         </w:numPr>
         <w:tabs>
           <w:tab w:val="clear" w:pos="709"/>
-          <w:tab w:val="left" w:pos="2127" w:leader="none"/>
-        </w:tabs>
-        <w:bidi w:val="0"/>
+          <w:tab w:val="left" w:pos="0" w:leader="none"/>
+        </w:tabs>
         <w:ind w:hanging="283" w:start="2127"/>
-        <w:jc w:val="start"/>
-        <w:rPr/>
-      </w:pPr>
-      <w:r>
-        <w:rPr>
-          <w:rStyle w:val="Strong"/>
-        </w:rPr>
-        <w:t>Verde (0-70%):</w:t>
-      </w:r>
-      <w:r>
-        <w:rPr/>
-        <w:t xml:space="preserve"> Tudo ok.</w:t>
+        <w:rPr/>
+      </w:pPr>
+      <w:r>
+        <w:rPr>
+          <w:rStyle w:val="Strong"/>
+        </w:rPr>
+        <w:t>Ícone Personalizado:</w:t>
+      </w:r>
+      <w:r>
+        <w:rPr/>
+        <w:t xml:space="preserve"> Escolhido pelo utilizador no cadastro.</w:t>
       </w:r>
     </w:p>
     <w:p>
@@ -209,22 +407,20 @@
         </w:numPr>
         <w:tabs>
           <w:tab w:val="clear" w:pos="709"/>
-          <w:tab w:val="left" w:pos="2127" w:leader="none"/>
-        </w:tabs>
-        <w:bidi w:val="0"/>
+          <w:tab w:val="left" w:pos="0" w:leader="none"/>
+        </w:tabs>
         <w:ind w:hanging="283" w:start="2127"/>
-        <w:jc w:val="start"/>
-        <w:rPr/>
-      </w:pPr>
-      <w:r>
-        <w:rPr>
-          <w:rStyle w:val="Strong"/>
-        </w:rPr>
-        <w:t>Amarelo (70-90%):</w:t>
-      </w:r>
-      <w:r>
-        <w:rPr/>
-        <w:t xml:space="preserve"> Atenção, revisão próxima.</w:t>
+        <w:rPr/>
+      </w:pPr>
+      <w:r>
+        <w:rPr>
+          <w:rStyle w:val="Strong"/>
+        </w:rPr>
+        <w:t>Nome e Ciclo:</w:t>
+      </w:r>
+      <w:r>
+        <w:rPr/>
+        <w:t xml:space="preserve"> Ex: "Óleo do Motor - Ciclo: 3000km".</w:t>
       </w:r>
     </w:p>
     <w:p>
@@ -236,141 +432,165 @@
         </w:numPr>
         <w:tabs>
           <w:tab w:val="clear" w:pos="709"/>
-          <w:tab w:val="left" w:pos="2127" w:leader="none"/>
-        </w:tabs>
-        <w:bidi w:val="0"/>
+          <w:tab w:val="left" w:pos="0" w:leader="none"/>
+        </w:tabs>
         <w:ind w:hanging="283" w:start="2127"/>
-        <w:jc w:val="start"/>
-        <w:rPr/>
-      </w:pPr>
-      <w:r>
-        <w:rPr>
-          <w:rStyle w:val="Strong"/>
-        </w:rPr>
-        <w:t>Vermelho (90-100%):</w:t>
-      </w:r>
-      <w:r>
-        <w:rPr/>
-        <w:t xml:space="preserve"> Manutenção urgente.</w:t>
-      </w:r>
-    </w:p>
-    <w:p>
-      <w:pPr>
-        <w:pStyle w:val="BodyText"/>
-        <w:numPr>
-          <w:ilvl w:val="1"/>
+        <w:rPr/>
+      </w:pPr>
+      <w:r>
+        <w:rPr>
+          <w:rStyle w:val="Strong"/>
+        </w:rPr>
+        <w:t>Barra de Desgaste:</w:t>
+      </w:r>
+      <w:r>
+        <w:rPr/>
+        <w:t xml:space="preserve"> Preenche da </w:t>
+      </w:r>
+      <w:r>
+        <w:rPr>
+          <w:rStyle w:val="Strong"/>
+        </w:rPr>
+        <w:t>esquerda para a direita</w:t>
+      </w:r>
+      <w:r>
+        <w:rPr/>
+        <w:t xml:space="preserve"> (0% a 100%).</w:t>
+      </w:r>
+    </w:p>
+    <w:p>
+      <w:pPr>
+        <w:pStyle w:val="BodyText"/>
+        <w:numPr>
+          <w:ilvl w:val="2"/>
           <w:numId w:val="1"/>
         </w:numPr>
         <w:tabs>
           <w:tab w:val="clear" w:pos="709"/>
-          <w:tab w:val="left" w:pos="1418" w:leader="none"/>
-        </w:tabs>
-        <w:bidi w:val="0"/>
-        <w:ind w:hanging="283" w:start="1418"/>
-        <w:jc w:val="start"/>
-        <w:rPr/>
-      </w:pPr>
-      <w:r>
-        <w:rPr>
-          <w:rStyle w:val="Strong"/>
-        </w:rPr>
-        <w:t>Texto Descritivo:</w:t>
-      </w:r>
-      <w:r>
-        <w:rPr/>
-        <w:t xml:space="preserve"> Ex: "Faltam </w:t>
-      </w:r>
-      <w:r>
-        <w:rPr>
-          <w:rStyle w:val="Strong"/>
-        </w:rPr>
-        <w:t>320 km</w:t>
-      </w:r>
-      <w:r>
-        <w:rPr/>
-        <w:t xml:space="preserve"> para a troca de óleo".</w:t>
-      </w:r>
-    </w:p>
-    <w:p>
-      <w:pPr>
-        <w:pStyle w:val="BodyText"/>
-        <w:numPr>
-          <w:ilvl w:val="0"/>
+          <w:tab w:val="left" w:pos="0" w:leader="none"/>
+        </w:tabs>
+        <w:ind w:hanging="283" w:start="2127"/>
+        <w:rPr/>
+      </w:pPr>
+      <w:r>
+        <w:rPr>
+          <w:rStyle w:val="Strong"/>
+        </w:rPr>
+        <w:t>Contador de KM:</w:t>
+      </w:r>
+      <w:r>
+        <w:rPr/>
+        <w:t xml:space="preserve"> Indica quanto falta ou quanto já excedeu o limite.</w:t>
+      </w:r>
+    </w:p>
+    <w:p>
+      <w:pPr>
+        <w:pStyle w:val="BodyText"/>
+        <w:numPr>
+          <w:ilvl w:val="2"/>
           <w:numId w:val="1"/>
         </w:numPr>
         <w:tabs>
           <w:tab w:val="clear" w:pos="709"/>
-          <w:tab w:val="left" w:pos="709" w:leader="none"/>
-        </w:tabs>
-        <w:bidi w:val="0"/>
-        <w:ind w:hanging="283" w:start="709"/>
-        <w:jc w:val="start"/>
-        <w:rPr/>
-      </w:pPr>
-      <w:r>
-        <w:rPr>
-          <w:rStyle w:val="Strong"/>
-        </w:rPr>
-        <w:t>Botão de Ação por Card:</w:t>
-      </w:r>
-    </w:p>
-    <w:p>
-      <w:pPr>
-        <w:pStyle w:val="BodyText"/>
-        <w:numPr>
-          <w:ilvl w:val="1"/>
+          <w:tab w:val="left" w:pos="0" w:leader="none"/>
+        </w:tabs>
+        <w:ind w:hanging="283" w:start="2127"/>
+        <w:rPr/>
+      </w:pPr>
+      <w:r>
+        <w:rPr>
+          <w:rStyle w:val="Strong"/>
+        </w:rPr>
+        <w:t>Botão "Manutenção Realizada":</w:t>
+      </w:r>
+      <w:r>
+        <w:rPr/>
+        <w:t xml:space="preserve"> Reinicia o ciclo do componente.</w:t>
+      </w:r>
+    </w:p>
+    <w:p>
+      <w:pPr>
+        <w:pStyle w:val="BodyText"/>
+        <w:numPr>
+          <w:ilvl w:val="2"/>
           <w:numId w:val="1"/>
         </w:numPr>
         <w:tabs>
           <w:tab w:val="clear" w:pos="709"/>
-          <w:tab w:val="left" w:pos="1418" w:leader="none"/>
-        </w:tabs>
-        <w:bidi w:val="0"/>
-        <w:ind w:hanging="283" w:start="1418"/>
-        <w:jc w:val="start"/>
-        <w:rPr/>
-      </w:pPr>
-      <w:r>
-        <w:rPr/>
-        <w:t>Botão "Realizei esta manutenção" ou ícone de "Reset" posicionado ao lado ou abaixo da barra.</w:t>
+          <w:tab w:val="left" w:pos="0" w:leader="none"/>
+        </w:tabs>
+        <w:ind w:hanging="283" w:start="2127"/>
+        <w:rPr/>
+      </w:pPr>
+      <w:r>
+        <w:rPr>
+          <w:rStyle w:val="Strong"/>
+        </w:rPr>
+        <w:t>Botão Ajustes:</w:t>
+      </w:r>
+      <w:r>
+        <w:rPr/>
+        <w:t xml:space="preserve"> Atalho para editar o intervalo ou remover o item.</w:t>
       </w:r>
     </w:p>
     <w:p>
       <w:pPr>
         <w:pStyle w:val="Heading2"/>
-        <w:bidi w:val="0"/>
         <w:spacing w:lineRule="auto" w:line="276" w:before="0" w:after="140"/>
-        <w:jc w:val="start"/>
-        <w:rPr/>
-      </w:pPr>
-      <w:r>
-        <w:rPr/>
+        <w:rPr>
+          <w:sz w:val="24"/>
+          <w:szCs w:val="24"/>
+        </w:rPr>
+      </w:pPr>
+      <w:r>
+        <w:rPr>
+          <w:sz w:val="24"/>
+          <w:szCs w:val="24"/>
+        </w:rPr>
         <w:t>2. Regras de Negócio e Lógica</w:t>
       </w:r>
     </w:p>
     <w:p>
       <w:pPr>
-        <w:pStyle w:val="BodyText"/>
-        <w:bidi w:val="0"/>
-        <w:jc w:val="start"/>
-        <w:rPr/>
-      </w:pPr>
-      <w:r>
-        <w:rPr/>
-        <w:t>A inteligência da tela depende do cruzamento da quilometragem atual com o registro da última manutenção.</w:t>
-      </w:r>
-    </w:p>
-    <w:p>
-      <w:pPr>
         <w:pStyle w:val="Heading3"/>
-        <w:bidi w:val="0"/>
         <w:spacing w:lineRule="auto" w:line="276" w:before="0" w:after="140"/>
-        <w:jc w:val="start"/>
-        <w:rPr/>
-      </w:pPr>
-      <w:r>
-        <w:rPr/>
-        <w:t>2.1. Lógica de Cálculo</w:t>
+        <w:rPr>
+          <w:sz w:val="24"/>
+          <w:szCs w:val="24"/>
+        </w:rPr>
+      </w:pPr>
+      <w:r>
+        <w:rPr>
+          <w:sz w:val="24"/>
+          <w:szCs w:val="24"/>
+        </w:rPr>
+        <w:t>2.1. Lógica de Desgaste (Barra e Cores)</w:t>
+      </w:r>
+    </w:p>
+    <w:p>
+      <w:pPr>
+        <w:pStyle w:val="BodyText"/>
+        <w:rPr/>
+      </w:pPr>
+      <w:r>
+        <w:rPr/>
+        <w:t xml:space="preserve">O sistema calcula o progresso com base na diferença entre o KM atual do veículo e o KM do último reset: </w:t>
+      </w:r>
+      <w:r>
+        <w:rPr>
+          <w:rStyle w:val="Cdigo-fonte"/>
+        </w:rPr>
+        <w:t>Rodado = KM_Atual_Veiculo - KM_Ultimo_Reset</w:t>
+      </w:r>
+      <w:r>
+        <w:rPr/>
+        <w:t xml:space="preserve"> </w:t>
+      </w:r>
+      <w:r>
+        <w:rPr>
+          <w:rStyle w:val="Cdigo-fonte"/>
+        </w:rPr>
+        <w:t>Percentagem = (Rodado / Intervalo_KM) * 100</w:t>
       </w:r>
     </w:p>
     <w:p>
@@ -382,32 +602,26 @@
         </w:numPr>
         <w:tabs>
           <w:tab w:val="clear" w:pos="709"/>
-          <w:tab w:val="left" w:pos="709" w:leader="none"/>
-        </w:tabs>
-        <w:bidi w:val="0"/>
+          <w:tab w:val="left" w:pos="0" w:leader="none"/>
+        </w:tabs>
         <w:ind w:hanging="283" w:start="709"/>
-        <w:jc w:val="start"/>
-        <w:rPr/>
-      </w:pPr>
-      <w:r>
-        <w:rPr>
-          <w:rStyle w:val="Strong"/>
-        </w:rPr>
-        <w:t>Diferença de Rodagem:</w:t>
-      </w:r>
-      <w:r>
-        <w:rPr/>
-        <w:t xml:space="preserve"> </w:t>
-      </w:r>
-      <w:r>
-        <w:rPr>
-          <w:rStyle w:val="Cdigo-fonte"/>
-        </w:rPr>
-        <w:t>KM_Atual (Dashboard) - KM_do_Ultimo_Reset</w:t>
-      </w:r>
-      <w:r>
-        <w:rPr/>
-        <w:t>.</w:t>
+        <w:rPr/>
+      </w:pPr>
+      <w:r>
+        <w:rPr>
+          <w:rStyle w:val="Strong"/>
+        </w:rPr>
+        <w:t xml:space="preserve">🟢 </w:t>
+      </w:r>
+      <w:r>
+        <w:rPr>
+          <w:rStyle w:val="Strong"/>
+        </w:rPr>
+        <w:t>Verde (OK):</w:t>
+      </w:r>
+      <w:r>
+        <w:rPr/>
+        <w:t xml:space="preserve"> Faltam mais de 500km para a revisão.</w:t>
       </w:r>
     </w:p>
     <w:p>
@@ -419,99 +633,26 @@
         </w:numPr>
         <w:tabs>
           <w:tab w:val="clear" w:pos="709"/>
-          <w:tab w:val="left" w:pos="709" w:leader="none"/>
-        </w:tabs>
-        <w:bidi w:val="0"/>
+          <w:tab w:val="left" w:pos="0" w:leader="none"/>
+        </w:tabs>
         <w:ind w:hanging="283" w:start="709"/>
-        <w:jc w:val="start"/>
-        <w:rPr/>
-      </w:pPr>
-      <w:r>
-        <w:rPr>
-          <w:rStyle w:val="Strong"/>
-        </w:rPr>
-        <w:t>Intervalos Sugeridos (Editáveis no futuro):</w:t>
-      </w:r>
-    </w:p>
-    <w:p>
-      <w:pPr>
-        <w:pStyle w:val="BodyText"/>
-        <w:numPr>
-          <w:ilvl w:val="1"/>
-          <w:numId w:val="2"/>
-        </w:numPr>
-        <w:tabs>
-          <w:tab w:val="clear" w:pos="709"/>
-          <w:tab w:val="left" w:pos="1418" w:leader="none"/>
-        </w:tabs>
-        <w:bidi w:val="0"/>
-        <w:ind w:hanging="283" w:start="1418"/>
-        <w:jc w:val="start"/>
-        <w:rPr/>
-      </w:pPr>
-      <w:r>
-        <w:rPr>
-          <w:rStyle w:val="Strong"/>
-        </w:rPr>
-        <w:t>Troca de Óleo:</w:t>
-      </w:r>
-      <w:r>
-        <w:rPr/>
-        <w:t xml:space="preserve"> 3.000 km.</w:t>
-      </w:r>
-    </w:p>
-    <w:p>
-      <w:pPr>
-        <w:pStyle w:val="BodyText"/>
-        <w:numPr>
-          <w:ilvl w:val="1"/>
-          <w:numId w:val="2"/>
-        </w:numPr>
-        <w:tabs>
-          <w:tab w:val="clear" w:pos="709"/>
-          <w:tab w:val="left" w:pos="1418" w:leader="none"/>
-        </w:tabs>
-        <w:bidi w:val="0"/>
-        <w:ind w:hanging="283" w:start="1418"/>
-        <w:jc w:val="start"/>
-        <w:rPr/>
-      </w:pPr>
-      <w:r>
-        <w:rPr>
-          <w:rStyle w:val="Strong"/>
-        </w:rPr>
-        <w:t>Kit Relação:</w:t>
-      </w:r>
-      <w:r>
-        <w:rPr/>
-        <w:t xml:space="preserve"> 15.000 km.</w:t>
-      </w:r>
-    </w:p>
-    <w:p>
-      <w:pPr>
-        <w:pStyle w:val="BodyText"/>
-        <w:numPr>
-          <w:ilvl w:val="1"/>
-          <w:numId w:val="2"/>
-        </w:numPr>
-        <w:tabs>
-          <w:tab w:val="clear" w:pos="709"/>
-          <w:tab w:val="left" w:pos="1418" w:leader="none"/>
-        </w:tabs>
-        <w:bidi w:val="0"/>
-        <w:ind w:hanging="283" w:start="1418"/>
-        <w:jc w:val="start"/>
-        <w:rPr/>
-      </w:pPr>
-      <w:r>
-        <w:rPr>
-          <w:rStyle w:val="Strong"/>
-        </w:rPr>
-        <w:t>Pneus:</w:t>
-      </w:r>
-      <w:r>
-        <w:rPr/>
-        <w:t xml:space="preserve"> 20.000 km.</w:t>
+        <w:rPr/>
+      </w:pPr>
+      <w:r>
+        <w:rPr>
+          <w:rStyle w:val="Strong"/>
+        </w:rPr>
+        <w:t xml:space="preserve">🟡 </w:t>
+      </w:r>
+      <w:r>
+        <w:rPr>
+          <w:rStyle w:val="Strong"/>
+        </w:rPr>
+        <w:t>Amarelo (Atenção):</w:t>
+      </w:r>
+      <w:r>
+        <w:rPr/>
+        <w:t xml:space="preserve"> Faltam entre 100km e 500km.</w:t>
       </w:r>
     </w:p>
     <w:p>
@@ -523,35 +664,53 @@
         </w:numPr>
         <w:tabs>
           <w:tab w:val="clear" w:pos="709"/>
-          <w:tab w:val="left" w:pos="709" w:leader="none"/>
-        </w:tabs>
-        <w:bidi w:val="0"/>
+          <w:tab w:val="left" w:pos="0" w:leader="none"/>
+        </w:tabs>
         <w:ind w:hanging="283" w:start="709"/>
-        <w:jc w:val="start"/>
-        <w:rPr/>
-      </w:pPr>
-      <w:r>
-        <w:rPr>
-          <w:rStyle w:val="Strong"/>
-        </w:rPr>
-        <w:t>Exemplo:</w:t>
-      </w:r>
-      <w:r>
-        <w:rPr/>
-        <w:t xml:space="preserve"> Se o usuário resetou o óleo aos 10.000 km e hoje está com 12.700 km, a barra mostra $90\%$ de preenchimento ($2.700 / 3.000$).</w:t>
+        <w:rPr/>
+      </w:pPr>
+      <w:r>
+        <w:rPr>
+          <w:rStyle w:val="Strong"/>
+        </w:rPr>
+        <w:t xml:space="preserve">🔴 </w:t>
+      </w:r>
+      <w:r>
+        <w:rPr>
+          <w:rStyle w:val="Strong"/>
+        </w:rPr>
+        <w:t>Vermelho (Crítico):</w:t>
+      </w:r>
+      <w:r>
+        <w:rPr/>
+        <w:t xml:space="preserve"> Faltam menos de 100km ou o limite já foi ultrapassado.</w:t>
       </w:r>
     </w:p>
     <w:p>
       <w:pPr>
         <w:pStyle w:val="Heading3"/>
-        <w:bidi w:val="0"/>
         <w:spacing w:lineRule="auto" w:line="276" w:before="0" w:after="140"/>
-        <w:jc w:val="start"/>
-        <w:rPr/>
-      </w:pPr>
-      <w:r>
-        <w:rPr/>
-        <w:t>2.2. Ação de Reset</w:t>
+        <w:rPr>
+          <w:sz w:val="24"/>
+          <w:szCs w:val="24"/>
+        </w:rPr>
+      </w:pPr>
+      <w:r>
+        <w:rPr>
+          <w:sz w:val="24"/>
+          <w:szCs w:val="24"/>
+        </w:rPr>
+        <w:t>2.2. Filtragem por Tipo de Veículo</w:t>
+      </w:r>
+    </w:p>
+    <w:p>
+      <w:pPr>
+        <w:pStyle w:val="BodyText"/>
+        <w:rPr/>
+      </w:pPr>
+      <w:r>
+        <w:rPr/>
+        <w:t>A oficina é inteligente e segmentada:</w:t>
       </w:r>
     </w:p>
     <w:p>
@@ -563,232 +722,80 @@
         </w:numPr>
         <w:tabs>
           <w:tab w:val="clear" w:pos="709"/>
-          <w:tab w:val="left" w:pos="709" w:leader="none"/>
-        </w:tabs>
-        <w:bidi w:val="0"/>
+          <w:tab w:val="left" w:pos="0" w:leader="none"/>
+        </w:tabs>
         <w:ind w:hanging="283" w:start="709"/>
-        <w:jc w:val="start"/>
-        <w:rPr/>
-      </w:pPr>
-      <w:r>
-        <w:rPr/>
-        <w:t xml:space="preserve">Ao clicar em "Realizei esta manutenção", o sistema captura o </w:t>
-      </w:r>
-      <w:r>
-        <w:rPr>
-          <w:rStyle w:val="Cdigo-fonte"/>
-        </w:rPr>
-        <w:t>KM_Atual</w:t>
-      </w:r>
-      <w:r>
-        <w:rPr/>
-        <w:t xml:space="preserve"> do sistema e o define como o novo ponto zero (</w:t>
-      </w:r>
-      <w:r>
-        <w:rPr>
-          <w:rStyle w:val="Cdigo-fonte"/>
-        </w:rPr>
-        <w:t>KM_do_Ultimo_Reset</w:t>
-      </w:r>
-      <w:r>
-        <w:rPr/>
-        <w:t>) para aquele item específico.</w:t>
-      </w:r>
-    </w:p>
-    <w:p>
-      <w:pPr>
-        <w:pStyle w:val="Heading2"/>
-        <w:bidi w:val="0"/>
+        <w:rPr/>
+      </w:pPr>
+      <w:r>
+        <w:rPr/>
+        <w:t xml:space="preserve">Se o veículo consultado for uma </w:t>
+      </w:r>
+      <w:r>
+        <w:rPr>
+          <w:rStyle w:val="Strong"/>
+        </w:rPr>
+        <w:t>Moto</w:t>
+      </w:r>
+      <w:r>
+        <w:rPr/>
+        <w:t>, apenas as manutenções de moto (Corrente, Pneu Traseiro, etc.) e os itens personalizados para aquela moto aparecem.</w:t>
+      </w:r>
+    </w:p>
+    <w:p>
+      <w:pPr>
+        <w:pStyle w:val="BodyText"/>
+        <w:numPr>
+          <w:ilvl w:val="0"/>
+          <w:numId w:val="3"/>
+        </w:numPr>
+        <w:tabs>
+          <w:tab w:val="clear" w:pos="709"/>
+          <w:tab w:val="left" w:pos="0" w:leader="none"/>
+        </w:tabs>
+        <w:ind w:hanging="283" w:start="709"/>
+        <w:rPr/>
+      </w:pPr>
+      <w:r>
+        <w:rPr/>
+        <w:t xml:space="preserve">Se for um </w:t>
+      </w:r>
+      <w:r>
+        <w:rPr>
+          <w:rStyle w:val="Strong"/>
+        </w:rPr>
+        <w:t>Carro</w:t>
+      </w:r>
+      <w:r>
+        <w:rPr/>
+        <w:t>, a lista muda automaticamente para itens de carro (Alinhamento, Óleo 10k, etc.).</w:t>
+      </w:r>
+    </w:p>
+    <w:p>
+      <w:pPr>
+        <w:pStyle w:val="Heading3"/>
         <w:spacing w:lineRule="auto" w:line="276" w:before="0" w:after="140"/>
-        <w:jc w:val="start"/>
-        <w:rPr/>
-      </w:pPr>
-      <w:r>
-        <w:rPr/>
-        <w:t>3. Persistência e Consultas (SQLite)</w:t>
-      </w:r>
-    </w:p>
-    <w:p>
-      <w:pPr>
-        <w:pStyle w:val="BodyText"/>
-        <w:bidi w:val="0"/>
-        <w:jc w:val="start"/>
-        <w:rPr/>
-      </w:pPr>
-      <w:r>
-        <w:rPr/>
-        <w:t>É necessária uma tabela para registrar quando cada item foi resetado pela última vez.</w:t>
-      </w:r>
-    </w:p>
-    <w:p>
-      <w:pPr>
-        <w:pStyle w:val="Heading3"/>
-        <w:bidi w:val="0"/>
-        <w:spacing w:lineRule="auto" w:line="276" w:before="0" w:after="140"/>
-        <w:jc w:val="start"/>
-        <w:rPr/>
-      </w:pPr>
-      <w:r>
-        <w:rPr/>
-        <w:t xml:space="preserve">Estrutura da Tabela </w:t>
-      </w:r>
-      <w:r>
-        <w:rPr>
-          <w:rStyle w:val="Cdigo-fonte"/>
-        </w:rPr>
-        <w:t>manutencao_status</w:t>
-      </w:r>
-      <w:r>
-        <w:rPr/>
-        <w:t>:</w:t>
-      </w:r>
-    </w:p>
-    <w:p>
-      <w:pPr>
-        <w:pStyle w:val="Textoprformatado"/>
-        <w:bidi w:val="0"/>
-        <w:spacing w:lineRule="auto" w:line="276" w:before="0" w:after="140"/>
-        <w:jc w:val="start"/>
-        <w:rPr/>
-      </w:pPr>
-      <w:r>
-        <w:rPr>
-          <w:rStyle w:val="Cdigo-fonte"/>
-        </w:rPr>
-        <w:t>CREATE TABLE IF NOT EXISTS manutencao_status (</w:t>
-      </w:r>
-    </w:p>
-    <w:p>
-      <w:pPr>
-        <w:pStyle w:val="Textoprformatado"/>
-        <w:bidi w:val="0"/>
-        <w:spacing w:lineRule="auto" w:line="276" w:before="0" w:after="140"/>
-        <w:jc w:val="start"/>
-        <w:rPr/>
-      </w:pPr>
-      <w:r>
-        <w:rPr>
-          <w:rStyle w:val="Cdigo-fonte"/>
-        </w:rPr>
-        <w:t xml:space="preserve">    </w:t>
-      </w:r>
-      <w:r>
-        <w:rPr>
-          <w:rStyle w:val="Cdigo-fonte"/>
-        </w:rPr>
-        <w:t>id INTEGER PRIMARY KEY AUTOINCREMENT,</w:t>
-      </w:r>
-    </w:p>
-    <w:p>
-      <w:pPr>
-        <w:pStyle w:val="Textoprformatado"/>
-        <w:bidi w:val="0"/>
-        <w:spacing w:lineRule="auto" w:line="276" w:before="0" w:after="140"/>
-        <w:jc w:val="start"/>
-        <w:rPr/>
-      </w:pPr>
-      <w:r>
-        <w:rPr>
-          <w:rStyle w:val="Cdigo-fonte"/>
-        </w:rPr>
-        <w:t xml:space="preserve">    </w:t>
-      </w:r>
-      <w:r>
-        <w:rPr>
-          <w:rStyle w:val="Cdigo-fonte"/>
-        </w:rPr>
-        <w:t>item_nome TEXT NOT NULL, -- Ex: 'Óleo', 'Pneu'</w:t>
-      </w:r>
-    </w:p>
-    <w:p>
-      <w:pPr>
-        <w:pStyle w:val="Textoprformatado"/>
-        <w:bidi w:val="0"/>
-        <w:spacing w:lineRule="auto" w:line="276" w:before="0" w:after="140"/>
-        <w:jc w:val="start"/>
-        <w:rPr/>
-      </w:pPr>
-      <w:r>
-        <w:rPr>
-          <w:rStyle w:val="Cdigo-fonte"/>
-        </w:rPr>
-        <w:t xml:space="preserve">    </w:t>
-      </w:r>
-      <w:r>
-        <w:rPr>
-          <w:rStyle w:val="Cdigo-fonte"/>
-        </w:rPr>
-        <w:t>intervalo_km INTEGER NOT NULL, -- Ex: 3000</w:t>
-      </w:r>
-    </w:p>
-    <w:p>
-      <w:pPr>
-        <w:pStyle w:val="Textoprformatado"/>
-        <w:bidi w:val="0"/>
-        <w:spacing w:lineRule="auto" w:line="276" w:before="0" w:after="140"/>
-        <w:jc w:val="start"/>
-        <w:rPr/>
-      </w:pPr>
-      <w:r>
-        <w:rPr>
-          <w:rStyle w:val="Cdigo-fonte"/>
-        </w:rPr>
-        <w:t xml:space="preserve">    </w:t>
-      </w:r>
-      <w:r>
-        <w:rPr>
-          <w:rStyle w:val="Cdigo-fonte"/>
-        </w:rPr>
-        <w:t>km_ultimo_reset INTEGER NOT NULL,</w:t>
-      </w:r>
-    </w:p>
-    <w:p>
-      <w:pPr>
-        <w:pStyle w:val="Textoprformatado"/>
-        <w:bidi w:val="0"/>
-        <w:spacing w:lineRule="auto" w:line="276" w:before="0" w:after="140"/>
-        <w:jc w:val="start"/>
-        <w:rPr/>
-      </w:pPr>
-      <w:r>
-        <w:rPr>
-          <w:rStyle w:val="Cdigo-fonte"/>
-        </w:rPr>
-        <w:t xml:space="preserve">    </w:t>
-      </w:r>
-      <w:r>
-        <w:rPr>
-          <w:rStyle w:val="Cdigo-fonte"/>
-        </w:rPr>
-        <w:t>data_ultimo_reset DATETIME DEFAULT CURRENT_TIMESTAMP</w:t>
-      </w:r>
-    </w:p>
-    <w:p>
-      <w:pPr>
-        <w:pStyle w:val="Textoprformatado"/>
-        <w:bidi w:val="0"/>
-        <w:spacing w:lineRule="auto" w:line="276" w:before="0" w:after="140"/>
-        <w:jc w:val="start"/>
-        <w:rPr/>
-      </w:pPr>
-      <w:r>
-        <w:rPr>
-          <w:rStyle w:val="Cdigo-fonte"/>
-        </w:rPr>
-        <w:t>);</w:t>
-      </w:r>
-    </w:p>
-    <w:p>
-      <w:pPr>
-        <w:pStyle w:val="Heading2"/>
-        <w:bidi w:val="0"/>
-        <w:spacing w:lineRule="auto" w:line="276" w:before="0" w:after="140"/>
-        <w:jc w:val="start"/>
-        <w:rPr/>
-      </w:pPr>
-      <w:r>
-        <w:rPr/>
-        <w:t>4. Fluxo de Navegação</w:t>
+        <w:rPr>
+          <w:sz w:val="24"/>
+          <w:szCs w:val="24"/>
+        </w:rPr>
+      </w:pPr>
+      <w:r>
+        <w:rPr>
+          <w:sz w:val="24"/>
+          <w:szCs w:val="24"/>
+        </w:rPr>
+        <w:t>2.3. Modal de Nova Manutenção</w:t>
+      </w:r>
+    </w:p>
+    <w:p>
+      <w:pPr>
+        <w:pStyle w:val="BodyText"/>
+        <w:rPr/>
+      </w:pPr>
+      <w:r>
+        <w:rPr/>
+        <w:t>Ao adicionar um item, o utilizador define:</w:t>
       </w:r>
     </w:p>
     <w:p>
@@ -800,22 +807,20 @@
         </w:numPr>
         <w:tabs>
           <w:tab w:val="clear" w:pos="709"/>
-          <w:tab w:val="left" w:pos="709" w:leader="none"/>
-        </w:tabs>
-        <w:bidi w:val="0"/>
+          <w:tab w:val="left" w:pos="0" w:leader="none"/>
+        </w:tabs>
         <w:ind w:hanging="283" w:start="709"/>
-        <w:jc w:val="start"/>
-        <w:rPr/>
-      </w:pPr>
-      <w:r>
-        <w:rPr>
-          <w:rStyle w:val="Strong"/>
-        </w:rPr>
-        <w:t>Entrada:</w:t>
-      </w:r>
-      <w:r>
-        <w:rPr/>
-        <w:t xml:space="preserve"> Usuário acessa pelo menu inferior ou através de um alerta de "Atenção" no Dashboard.</w:t>
+        <w:rPr/>
+      </w:pPr>
+      <w:r>
+        <w:rPr>
+          <w:rStyle w:val="Strong"/>
+        </w:rPr>
+        <w:t>Veículo Alvo:</w:t>
+      </w:r>
+      <w:r>
+        <w:rPr/>
+        <w:t xml:space="preserve"> (Default: Veículo atualmente em consulta).</w:t>
       </w:r>
     </w:p>
     <w:p>
@@ -827,22 +832,16 @@
         </w:numPr>
         <w:tabs>
           <w:tab w:val="clear" w:pos="709"/>
-          <w:tab w:val="left" w:pos="709" w:leader="none"/>
-        </w:tabs>
-        <w:bidi w:val="0"/>
+          <w:tab w:val="left" w:pos="0" w:leader="none"/>
+        </w:tabs>
         <w:ind w:hanging="283" w:start="709"/>
-        <w:jc w:val="start"/>
-        <w:rPr/>
-      </w:pPr>
-      <w:r>
-        <w:rPr>
-          <w:rStyle w:val="Strong"/>
-        </w:rPr>
-        <w:t>Consulta:</w:t>
-      </w:r>
-      <w:r>
-        <w:rPr/>
-        <w:t xml:space="preserve"> O app lê o KM atual e as datas de reset para calcular as barras de progresso.</w:t>
+        <w:rPr/>
+      </w:pPr>
+      <w:r>
+        <w:rPr>
+          <w:rStyle w:val="Strong"/>
+        </w:rPr>
+        <w:t>Nome do Componente.</w:t>
       </w:r>
     </w:p>
     <w:p>
@@ -854,22 +853,20 @@
         </w:numPr>
         <w:tabs>
           <w:tab w:val="clear" w:pos="709"/>
-          <w:tab w:val="left" w:pos="709" w:leader="none"/>
-        </w:tabs>
-        <w:bidi w:val="0"/>
+          <w:tab w:val="left" w:pos="0" w:leader="none"/>
+        </w:tabs>
         <w:ind w:hanging="283" w:start="709"/>
-        <w:jc w:val="start"/>
-        <w:rPr/>
-      </w:pPr>
-      <w:r>
-        <w:rPr>
-          <w:rStyle w:val="Strong"/>
-        </w:rPr>
-        <w:t>Ação:</w:t>
-      </w:r>
-      <w:r>
-        <w:rPr/>
-        <w:t xml:space="preserve"> O usuário troca o óleo na oficina e clica no botão de reset no app.</w:t>
+        <w:rPr/>
+      </w:pPr>
+      <w:r>
+        <w:rPr>
+          <w:rStyle w:val="Strong"/>
+        </w:rPr>
+        <w:t>Intervalo (KM):</w:t>
+      </w:r>
+      <w:r>
+        <w:rPr/>
+        <w:t xml:space="preserve"> Periodicidade da troca.</w:t>
       </w:r>
     </w:p>
     <w:p>
@@ -881,35 +878,334 @@
         </w:numPr>
         <w:tabs>
           <w:tab w:val="clear" w:pos="709"/>
-          <w:tab w:val="left" w:pos="709" w:leader="none"/>
-        </w:tabs>
-        <w:bidi w:val="0"/>
+          <w:tab w:val="left" w:pos="0" w:leader="none"/>
+        </w:tabs>
         <w:ind w:hanging="283" w:start="709"/>
-        <w:jc w:val="start"/>
-        <w:rPr/>
-      </w:pPr>
-      <w:r>
-        <w:rPr>
-          <w:rStyle w:val="Strong"/>
-        </w:rPr>
-        <w:t>Feedback:</w:t>
-      </w:r>
-      <w:r>
-        <w:rPr/>
-        <w:t xml:space="preserve"> A barra volta para 0% (Verde) e exibe: "Próxima troca em 3.000 km".</w:t>
+        <w:rPr/>
+      </w:pPr>
+      <w:r>
+        <w:rPr>
+          <w:rStyle w:val="Strong"/>
+        </w:rPr>
+        <w:t>Ícone Representativo:</w:t>
+      </w:r>
+      <w:r>
+        <w:rPr/>
+        <w:t xml:space="preserve"> Escolha entre 8 categorias visuais.</w:t>
       </w:r>
     </w:p>
     <w:p>
       <w:pPr>
         <w:pStyle w:val="Heading2"/>
-        <w:bidi w:val="0"/>
         <w:spacing w:lineRule="auto" w:line="276" w:before="0" w:after="140"/>
-        <w:jc w:val="start"/>
-        <w:rPr/>
-      </w:pPr>
-      <w:r>
-        <w:rPr/>
-        <w:t>5. Dicas para Desenvolvedor (Performance)</w:t>
+        <w:rPr>
+          <w:sz w:val="24"/>
+          <w:szCs w:val="24"/>
+        </w:rPr>
+      </w:pPr>
+      <w:r>
+        <w:rPr>
+          <w:sz w:val="24"/>
+          <w:szCs w:val="24"/>
+        </w:rPr>
+        <w:t>3. Persistência de Dados (SQLite)</w:t>
+      </w:r>
+    </w:p>
+    <w:p>
+      <w:pPr>
+        <w:pStyle w:val="BodyText"/>
+        <w:rPr/>
+      </w:pPr>
+      <w:r>
+        <w:rPr/>
+        <w:t xml:space="preserve">As operações seguem a tabela </w:t>
+      </w:r>
+      <w:r>
+        <w:rPr>
+          <w:rStyle w:val="Cdigo-fonte"/>
+        </w:rPr>
+        <w:t>manutencao_status</w:t>
+      </w:r>
+      <w:r>
+        <w:rPr/>
+        <w:t xml:space="preserve"> definida no </w:t>
+      </w:r>
+      <w:r>
+        <w:rPr>
+          <w:rStyle w:val="Cdigo-fonte"/>
+        </w:rPr>
+        <w:t>DatabaseInit.ts</w:t>
+      </w:r>
+      <w:r>
+        <w:rPr/>
+        <w:t>:</w:t>
+      </w:r>
+    </w:p>
+    <w:p>
+      <w:pPr>
+        <w:pStyle w:val="Heading3"/>
+        <w:spacing w:lineRule="auto" w:line="276" w:before="0" w:after="140"/>
+        <w:rPr>
+          <w:sz w:val="24"/>
+          <w:szCs w:val="24"/>
+        </w:rPr>
+      </w:pPr>
+      <w:r>
+        <w:rPr>
+          <w:sz w:val="24"/>
+          <w:szCs w:val="24"/>
+        </w:rPr>
+        <w:t>3.1. Consulta de Itens</w:t>
+      </w:r>
+    </w:p>
+    <w:p>
+      <w:pPr>
+        <w:pStyle w:val="Textoprformatado"/>
+        <w:spacing w:lineRule="auto" w:line="276" w:before="0" w:after="140"/>
+        <w:rPr>
+          <w:rFonts w:ascii="Liberation Serif" w:hAnsi="Liberation Serif" w:eastAsia="NSimSun" w:cs="Lucida Sans"/>
+          <w:sz w:val="24"/>
+          <w:szCs w:val="24"/>
+        </w:rPr>
+      </w:pPr>
+      <w:r>
+        <w:rPr>
+          <w:rStyle w:val="Cdigo-fonte"/>
+          <w:rFonts w:ascii="Liberation Serif" w:hAnsi="Liberation Serif"/>
+          <w:sz w:val="24"/>
+          <w:szCs w:val="24"/>
+        </w:rPr>
+        <w:t xml:space="preserve">SELECT * FROM manutencao_status </w:t>
+      </w:r>
+    </w:p>
+    <w:p>
+      <w:pPr>
+        <w:pStyle w:val="Textoprformatado"/>
+        <w:spacing w:lineRule="auto" w:line="276" w:before="0" w:after="140"/>
+        <w:rPr>
+          <w:rFonts w:ascii="Liberation Serif" w:hAnsi="Liberation Serif" w:eastAsia="NSimSun" w:cs="Lucida Sans"/>
+          <w:sz w:val="24"/>
+          <w:szCs w:val="24"/>
+        </w:rPr>
+      </w:pPr>
+      <w:r>
+        <w:rPr>
+          <w:rStyle w:val="Cdigo-fonte"/>
+          <w:rFonts w:ascii="Liberation Serif" w:hAnsi="Liberation Serif"/>
+          <w:sz w:val="24"/>
+          <w:szCs w:val="24"/>
+        </w:rPr>
+        <w:t xml:space="preserve">WHERE veiculo_id = ? </w:t>
+      </w:r>
+    </w:p>
+    <w:p>
+      <w:pPr>
+        <w:pStyle w:val="Textoprformatado"/>
+        <w:spacing w:lineRule="auto" w:line="276" w:before="0" w:after="140"/>
+        <w:rPr>
+          <w:rFonts w:ascii="Liberation Serif" w:hAnsi="Liberation Serif" w:eastAsia="NSimSun" w:cs="Lucida Sans"/>
+          <w:sz w:val="24"/>
+          <w:szCs w:val="24"/>
+        </w:rPr>
+      </w:pPr>
+      <w:r>
+        <w:rPr>
+          <w:rStyle w:val="Cdigo-fonte"/>
+          <w:rFonts w:ascii="Liberation Serif" w:hAnsi="Liberation Serif"/>
+          <w:sz w:val="24"/>
+          <w:szCs w:val="24"/>
+        </w:rPr>
+        <w:t>ORDER BY priority DESC;</w:t>
+      </w:r>
+    </w:p>
+    <w:p>
+      <w:pPr>
+        <w:pStyle w:val="Heading3"/>
+        <w:spacing w:lineRule="auto" w:line="276" w:before="0" w:after="140"/>
+        <w:rPr>
+          <w:sz w:val="24"/>
+          <w:szCs w:val="24"/>
+        </w:rPr>
+      </w:pPr>
+      <w:r>
+        <w:rPr>
+          <w:sz w:val="24"/>
+          <w:szCs w:val="24"/>
+        </w:rPr>
+        <w:t>3.2. Registo de Manutenção (Reset)</w:t>
+      </w:r>
+    </w:p>
+    <w:p>
+      <w:pPr>
+        <w:pStyle w:val="BodyText"/>
+        <w:rPr/>
+      </w:pPr>
+      <w:r>
+        <w:rPr/>
+        <w:t>Ao clicar em "Manutenção Realizada":</w:t>
+      </w:r>
+    </w:p>
+    <w:p>
+      <w:pPr>
+        <w:pStyle w:val="Textoprformatado"/>
+        <w:spacing w:lineRule="auto" w:line="276" w:before="0" w:after="140"/>
+        <w:rPr>
+          <w:rFonts w:ascii="Liberation Serif" w:hAnsi="Liberation Serif" w:eastAsia="NSimSun" w:cs="Lucida Sans"/>
+          <w:sz w:val="24"/>
+          <w:szCs w:val="24"/>
+        </w:rPr>
+      </w:pPr>
+      <w:r>
+        <w:rPr>
+          <w:rStyle w:val="Cdigo-fonte"/>
+          <w:rFonts w:ascii="Liberation Serif" w:hAnsi="Liberation Serif"/>
+          <w:sz w:val="24"/>
+          <w:szCs w:val="24"/>
+        </w:rPr>
+        <w:t xml:space="preserve">UPDATE manutencao_status </w:t>
+      </w:r>
+    </w:p>
+    <w:p>
+      <w:pPr>
+        <w:pStyle w:val="Textoprformatado"/>
+        <w:spacing w:lineRule="auto" w:line="276" w:before="0" w:after="140"/>
+        <w:rPr>
+          <w:rFonts w:ascii="Liberation Serif" w:hAnsi="Liberation Serif" w:eastAsia="NSimSun" w:cs="Lucida Sans"/>
+          <w:sz w:val="24"/>
+          <w:szCs w:val="24"/>
+        </w:rPr>
+      </w:pPr>
+      <w:r>
+        <w:rPr>
+          <w:rStyle w:val="Cdigo-fonte"/>
+          <w:rFonts w:ascii="Liberation Serif" w:hAnsi="Liberation Serif"/>
+          <w:sz w:val="24"/>
+          <w:szCs w:val="24"/>
+        </w:rPr>
+        <w:t>SET km_ultimo_reset = (SELECT km_atual FROM veiculos WHERE id = ?),</w:t>
+      </w:r>
+    </w:p>
+    <w:p>
+      <w:pPr>
+        <w:pStyle w:val="Textoprformatado"/>
+        <w:spacing w:lineRule="auto" w:line="276" w:before="0" w:after="140"/>
+        <w:rPr>
+          <w:rFonts w:ascii="Liberation Serif" w:hAnsi="Liberation Serif" w:eastAsia="NSimSun" w:cs="Lucida Sans"/>
+          <w:sz w:val="24"/>
+          <w:szCs w:val="24"/>
+        </w:rPr>
+      </w:pPr>
+      <w:r>
+        <w:rPr>
+          <w:rStyle w:val="Cdigo-fonte"/>
+          <w:rFonts w:ascii="Liberation Serif" w:hAnsi="Liberation Serif"/>
+          <w:sz w:val="24"/>
+          <w:szCs w:val="24"/>
+        </w:rPr>
+        <w:t xml:space="preserve">    </w:t>
+      </w:r>
+      <w:r>
+        <w:rPr>
+          <w:rStyle w:val="Cdigo-fonte"/>
+          <w:rFonts w:ascii="Liberation Serif" w:hAnsi="Liberation Serif"/>
+          <w:sz w:val="24"/>
+          <w:szCs w:val="24"/>
+        </w:rPr>
+        <w:t>data_ultimo_reset = CURRENT_TIMESTAMP</w:t>
+      </w:r>
+    </w:p>
+    <w:p>
+      <w:pPr>
+        <w:pStyle w:val="Textoprformatado"/>
+        <w:spacing w:lineRule="auto" w:line="276" w:before="0" w:after="140"/>
+        <w:rPr>
+          <w:rFonts w:ascii="Liberation Serif" w:hAnsi="Liberation Serif" w:eastAsia="NSimSun" w:cs="Lucida Sans"/>
+          <w:sz w:val="24"/>
+          <w:szCs w:val="24"/>
+        </w:rPr>
+      </w:pPr>
+      <w:r>
+        <w:rPr>
+          <w:rStyle w:val="Cdigo-fonte"/>
+          <w:rFonts w:ascii="Liberation Serif" w:hAnsi="Liberation Serif"/>
+          <w:sz w:val="24"/>
+          <w:szCs w:val="24"/>
+        </w:rPr>
+        <w:t>WHERE id = ?;</w:t>
+      </w:r>
+    </w:p>
+    <w:p>
+      <w:pPr>
+        <w:pStyle w:val="Heading3"/>
+        <w:spacing w:lineRule="auto" w:line="276" w:before="0" w:after="140"/>
+        <w:rPr>
+          <w:sz w:val="24"/>
+          <w:szCs w:val="24"/>
+        </w:rPr>
+      </w:pPr>
+      <w:r>
+        <w:rPr>
+          <w:sz w:val="24"/>
+          <w:szCs w:val="24"/>
+        </w:rPr>
+        <w:t>3.3. Inserção de Novo Tipo</w:t>
+      </w:r>
+    </w:p>
+    <w:p>
+      <w:pPr>
+        <w:pStyle w:val="Textoprformatado"/>
+        <w:spacing w:lineRule="auto" w:line="276" w:before="0" w:after="140"/>
+        <w:rPr>
+          <w:rFonts w:ascii="Liberation Serif" w:hAnsi="Liberation Serif" w:eastAsia="NSimSun" w:cs="Lucida Sans"/>
+          <w:sz w:val="24"/>
+          <w:szCs w:val="24"/>
+        </w:rPr>
+      </w:pPr>
+      <w:r>
+        <w:rPr>
+          <w:rStyle w:val="Cdigo-fonte"/>
+          <w:rFonts w:ascii="Liberation Serif" w:hAnsi="Liberation Serif"/>
+          <w:sz w:val="24"/>
+          <w:szCs w:val="24"/>
+        </w:rPr>
+        <w:t>INSERT INTO manutencao_status (veiculo_id, item_nome, intervalo_km, km_ultimo_reset, icon_id)</w:t>
+      </w:r>
+    </w:p>
+    <w:p>
+      <w:pPr>
+        <w:pStyle w:val="Textoprformatado"/>
+        <w:spacing w:lineRule="auto" w:line="276" w:before="0" w:after="140"/>
+        <w:rPr>
+          <w:rFonts w:ascii="Liberation Serif" w:hAnsi="Liberation Serif" w:eastAsia="NSimSun" w:cs="Lucida Sans"/>
+          <w:sz w:val="24"/>
+          <w:szCs w:val="24"/>
+        </w:rPr>
+      </w:pPr>
+      <w:r>
+        <w:rPr>
+          <w:rStyle w:val="Cdigo-fonte"/>
+          <w:rFonts w:ascii="Liberation Serif" w:hAnsi="Liberation Serif"/>
+          <w:sz w:val="24"/>
+          <w:szCs w:val="24"/>
+        </w:rPr>
+        <w:t>VALUES (?, ?, ?, (SELECT km_atual FROM veiculos WHERE id = ?), ?);</w:t>
+      </w:r>
+    </w:p>
+    <w:p>
+      <w:pPr>
+        <w:pStyle w:val="Heading2"/>
+        <w:spacing w:lineRule="auto" w:line="276" w:before="0" w:after="140"/>
+        <w:rPr>
+          <w:sz w:val="24"/>
+          <w:szCs w:val="24"/>
+        </w:rPr>
+      </w:pPr>
+      <w:r>
+        <w:rPr>
+          <w:sz w:val="24"/>
+          <w:szCs w:val="24"/>
+        </w:rPr>
+        <w:t>4. Fluxo de Navegação</w:t>
       </w:r>
     </w:p>
     <w:p>
@@ -921,22 +1217,20 @@
         </w:numPr>
         <w:tabs>
           <w:tab w:val="clear" w:pos="709"/>
-          <w:tab w:val="left" w:pos="709" w:leader="none"/>
-        </w:tabs>
-        <w:bidi w:val="0"/>
+          <w:tab w:val="left" w:pos="0" w:leader="none"/>
+        </w:tabs>
         <w:ind w:hanging="283" w:start="709"/>
-        <w:jc w:val="start"/>
-        <w:rPr/>
-      </w:pPr>
-      <w:r>
-        <w:rPr>
-          <w:rStyle w:val="Strong"/>
-        </w:rPr>
-        <w:t>Notificações Locais:</w:t>
-      </w:r>
-      <w:r>
-        <w:rPr/>
-        <w:t xml:space="preserve"> Quando um item atingir 95% da barra, o app pode disparar uma notificação push local (mesmo offline) para avisar o usuário.</w:t>
+        <w:rPr/>
+      </w:pPr>
+      <w:r>
+        <w:rPr>
+          <w:rStyle w:val="Strong"/>
+        </w:rPr>
+        <w:t>Entrada:</w:t>
+      </w:r>
+      <w:r>
+        <w:rPr/>
+        <w:t xml:space="preserve"> Dashboard ➔ Botão "Oficina".</w:t>
       </w:r>
     </w:p>
     <w:p>
@@ -948,22 +1242,20 @@
         </w:numPr>
         <w:tabs>
           <w:tab w:val="clear" w:pos="709"/>
-          <w:tab w:val="left" w:pos="709" w:leader="none"/>
-        </w:tabs>
-        <w:bidi w:val="0"/>
+          <w:tab w:val="left" w:pos="0" w:leader="none"/>
+        </w:tabs>
         <w:ind w:hanging="283" w:start="709"/>
-        <w:jc w:val="start"/>
-        <w:rPr/>
-      </w:pPr>
-      <w:r>
-        <w:rPr>
-          <w:rStyle w:val="Strong"/>
-        </w:rPr>
-        <w:t>Flexibilidade:</w:t>
-      </w:r>
-      <w:r>
-        <w:rPr/>
-        <w:t xml:space="preserve"> Permita que o usuário configure o intervalo (alguns trocam óleo com 1.000km, outros com 3.000km).</w:t>
+        <w:rPr/>
+      </w:pPr>
+      <w:r>
+        <w:rPr>
+          <w:rStyle w:val="Strong"/>
+        </w:rPr>
+        <w:t>Troca de Máquina:</w:t>
+      </w:r>
+      <w:r>
+        <w:rPr/>
+        <w:t xml:space="preserve"> Clique no seletor lateral do veículo ➔ Escolha na lista ➔ UI atualiza os itens.</w:t>
       </w:r>
     </w:p>
     <w:p>
@@ -975,32 +1267,20 @@
         </w:numPr>
         <w:tabs>
           <w:tab w:val="clear" w:pos="709"/>
-          <w:tab w:val="left" w:pos="709" w:leader="none"/>
-        </w:tabs>
-        <w:bidi w:val="0"/>
+          <w:tab w:val="left" w:pos="0" w:leader="none"/>
+        </w:tabs>
         <w:ind w:hanging="283" w:start="709"/>
-        <w:jc w:val="start"/>
-        <w:rPr/>
-      </w:pPr>
-      <w:r>
-        <w:rPr>
-          <w:rStyle w:val="Strong"/>
-        </w:rPr>
-        <w:t>Animações de Barra:</w:t>
-      </w:r>
-      <w:r>
-        <w:rPr/>
-        <w:t xml:space="preserve"> Use transições suaves (</w:t>
-      </w:r>
-      <w:r>
-        <w:rPr>
-          <w:rStyle w:val="Cdigo-fonte"/>
-        </w:rPr>
-        <w:t>transition</w:t>
-      </w:r>
-      <w:r>
-        <w:rPr/>
-        <w:t>) ao preencher as barras para tornar a interface mais moderna e agradável.</w:t>
+        <w:rPr/>
+      </w:pPr>
+      <w:r>
+        <w:rPr>
+          <w:rStyle w:val="Strong"/>
+        </w:rPr>
+        <w:t>Ação de Cuidado:</w:t>
+      </w:r>
+      <w:r>
+        <w:rPr/>
+        <w:t xml:space="preserve"> Clique em "Manutenção Realizada" ➔ Confirmação no Modal ➔ Barra volta a 0%.</w:t>
       </w:r>
     </w:p>
     <w:p>
@@ -1012,22 +1292,142 @@
         </w:numPr>
         <w:tabs>
           <w:tab w:val="clear" w:pos="709"/>
-          <w:tab w:val="left" w:pos="709" w:leader="none"/>
-        </w:tabs>
-        <w:bidi w:val="0"/>
+          <w:tab w:val="left" w:pos="0" w:leader="none"/>
+        </w:tabs>
         <w:ind w:hanging="283" w:start="709"/>
-        <w:jc w:val="start"/>
-        <w:rPr/>
-      </w:pPr>
-      <w:r>
-        <w:rPr>
-          <w:rStyle w:val="Strong"/>
-        </w:rPr>
-        <w:t>Sincronização com KM:</w:t>
-      </w:r>
-      <w:r>
-        <w:rPr/>
-        <w:t xml:space="preserve"> Sempre que o usuário atualizar o "KM de agora" no Dashboard, a tela de manutenção deve ser recalculada em segundo plano.</w:t>
+        <w:rPr/>
+      </w:pPr>
+      <w:r>
+        <w:rPr>
+          <w:rStyle w:val="Strong"/>
+        </w:rPr>
+        <w:t>Expansão:</w:t>
+      </w:r>
+      <w:r>
+        <w:rPr/>
+        <w:t xml:space="preserve"> Botão </w:t>
+      </w:r>
+      <w:r>
+        <w:rPr>
+          <w:rStyle w:val="Cdigo-fonte"/>
+        </w:rPr>
+        <w:t>+</w:t>
+      </w:r>
+      <w:r>
+        <w:rPr/>
+        <w:t xml:space="preserve"> no topo ➔ Preencher dados e escolher ícone ➔ Item entra na lista do veículo escolhido.</w:t>
+      </w:r>
+    </w:p>
+    <w:p>
+      <w:pPr>
+        <w:pStyle w:val="Heading2"/>
+        <w:spacing w:lineRule="auto" w:line="276" w:before="0" w:after="140"/>
+        <w:rPr>
+          <w:sz w:val="24"/>
+          <w:szCs w:val="24"/>
+        </w:rPr>
+      </w:pPr>
+      <w:r>
+        <w:rPr>
+          <w:sz w:val="24"/>
+          <w:szCs w:val="24"/>
+        </w:rPr>
+        <w:t>5. Notas para o Desenvolvedor</w:t>
+      </w:r>
+    </w:p>
+    <w:p>
+      <w:pPr>
+        <w:pStyle w:val="BodyText"/>
+        <w:numPr>
+          <w:ilvl w:val="0"/>
+          <w:numId w:val="6"/>
+        </w:numPr>
+        <w:tabs>
+          <w:tab w:val="clear" w:pos="709"/>
+          <w:tab w:val="left" w:pos="0" w:leader="none"/>
+        </w:tabs>
+        <w:ind w:hanging="283" w:start="709"/>
+        <w:rPr/>
+      </w:pPr>
+      <w:r>
+        <w:rPr>
+          <w:rStyle w:val="Strong"/>
+        </w:rPr>
+        <w:t>Animação:</w:t>
+      </w:r>
+      <w:r>
+        <w:rPr/>
+        <w:t xml:space="preserve"> A barra de progresso deve ter uma transição suave (</w:t>
+      </w:r>
+      <w:r>
+        <w:rPr>
+          <w:rStyle w:val="Cdigo-fonte"/>
+        </w:rPr>
+        <w:t>duration-1000</w:t>
+      </w:r>
+      <w:r>
+        <w:rPr/>
+        <w:t>) ao carregar o ecrã para dar feedback de preenchimento.</w:t>
+      </w:r>
+    </w:p>
+    <w:p>
+      <w:pPr>
+        <w:pStyle w:val="BodyText"/>
+        <w:numPr>
+          <w:ilvl w:val="0"/>
+          <w:numId w:val="6"/>
+        </w:numPr>
+        <w:tabs>
+          <w:tab w:val="clear" w:pos="709"/>
+          <w:tab w:val="left" w:pos="0" w:leader="none"/>
+        </w:tabs>
+        <w:ind w:hanging="283" w:start="709"/>
+        <w:rPr/>
+      </w:pPr>
+      <w:r>
+        <w:rPr>
+          <w:rStyle w:val="Strong"/>
+        </w:rPr>
+        <w:t>Ícones:</w:t>
+      </w:r>
+      <w:r>
+        <w:rPr/>
+        <w:t xml:space="preserve"> Utilizar o mapeamento de IDs de string para componentes </w:t>
+      </w:r>
+      <w:r>
+        <w:rPr>
+          <w:rStyle w:val="Cdigo-fonte"/>
+        </w:rPr>
+        <w:t>Lucide</w:t>
+      </w:r>
+      <w:r>
+        <w:rPr/>
+        <w:t xml:space="preserve"> conforme implementado no protótipo.</w:t>
+      </w:r>
+    </w:p>
+    <w:p>
+      <w:pPr>
+        <w:pStyle w:val="BodyText"/>
+        <w:numPr>
+          <w:ilvl w:val="0"/>
+          <w:numId w:val="6"/>
+        </w:numPr>
+        <w:tabs>
+          <w:tab w:val="clear" w:pos="709"/>
+          <w:tab w:val="left" w:pos="0" w:leader="none"/>
+        </w:tabs>
+        <w:ind w:hanging="283" w:start="709"/>
+        <w:rPr/>
+      </w:pPr>
+      <w:r>
+        <w:rPr>
+          <w:rStyle w:val="Strong"/>
+        </w:rPr>
+        <w:t>Estado Global:</w:t>
+      </w:r>
+      <w:r>
+        <w:rPr/>
+        <w:t xml:space="preserve"> Quando um reset é feito na oficina, o "Alerta Mecânico" do Dashboard deve ser atualizado na próxima vez que for visualizado.</w:t>
       </w:r>
     </w:p>
     <w:p>
@@ -1049,6 +1449,7 @@
       <w:pgNumType w:fmt="decimal"/>
       <w:formProt w:val="false"/>
       <w:textDirection w:val="lrTb"/>
+      <w:docGrid w:type="default" w:linePitch="100" w:charSpace="0"/>
     </w:sectPr>
   </w:body>
 </w:document>
@@ -1059,8 +1460,8 @@
   <w:abstractNum w:abstractNumId="1">
     <w:lvl w:ilvl="0">
       <w:start w:val="1"/>
-      <w:numFmt w:val="bullet"/>
-      <w:lvlText w:val=""/>
+      <w:numFmt w:val="decimal"/>
+      <w:lvlText w:val="%1."/>
       <w:lvlJc w:val="start"/>
       <w:pPr>
         <w:tabs>
@@ -1068,9 +1469,7 @@
         </w:tabs>
         <w:ind w:start="709" w:hanging="283"/>
       </w:pPr>
-      <w:rPr>
-        <w:rFonts w:ascii="Symbol" w:hAnsi="Symbol" w:cs="Symbol" w:hint="default"/>
-      </w:rPr>
+      <w:rPr/>
     </w:lvl>
     <w:lvl w:ilvl="1">
       <w:start w:val="1"/>
@@ -1589,8 +1988,8 @@
   <w:abstractNum w:abstractNumId="5">
     <w:lvl w:ilvl="0">
       <w:start w:val="1"/>
-      <w:numFmt w:val="bullet"/>
-      <w:lvlText w:val=""/>
+      <w:numFmt w:val="decimal"/>
+      <w:lvlText w:val="%1."/>
       <w:lvlJc w:val="start"/>
       <w:pPr>
         <w:tabs>
@@ -1598,14 +1997,12 @@
         </w:tabs>
         <w:ind w:start="709" w:hanging="283"/>
       </w:pPr>
-      <w:rPr>
-        <w:rFonts w:ascii="Symbol" w:hAnsi="Symbol" w:cs="Symbol" w:hint="default"/>
-      </w:rPr>
+      <w:rPr/>
     </w:lvl>
     <w:lvl w:ilvl="1">
       <w:start w:val="1"/>
-      <w:numFmt w:val="bullet"/>
-      <w:lvlText w:val=""/>
+      <w:numFmt w:val="decimal"/>
+      <w:lvlText w:val="%2."/>
       <w:lvlJc w:val="start"/>
       <w:pPr>
         <w:tabs>
@@ -1613,14 +2010,12 @@
         </w:tabs>
         <w:ind w:start="1418" w:hanging="283"/>
       </w:pPr>
-      <w:rPr>
-        <w:rFonts w:ascii="Symbol" w:hAnsi="Symbol" w:cs="Symbol" w:hint="default"/>
-      </w:rPr>
+      <w:rPr/>
     </w:lvl>
     <w:lvl w:ilvl="2">
       <w:start w:val="1"/>
-      <w:numFmt w:val="bullet"/>
-      <w:lvlText w:val=""/>
+      <w:numFmt w:val="decimal"/>
+      <w:lvlText w:val="%3."/>
       <w:lvlJc w:val="start"/>
       <w:pPr>
         <w:tabs>
@@ -1628,14 +2023,12 @@
         </w:tabs>
         <w:ind w:start="2127" w:hanging="283"/>
       </w:pPr>
-      <w:rPr>
-        <w:rFonts w:ascii="Symbol" w:hAnsi="Symbol" w:cs="Symbol" w:hint="default"/>
-      </w:rPr>
+      <w:rPr/>
     </w:lvl>
     <w:lvl w:ilvl="3">
       <w:start w:val="1"/>
-      <w:numFmt w:val="bullet"/>
-      <w:lvlText w:val=""/>
+      <w:numFmt w:val="decimal"/>
+      <w:lvlText w:val="%4."/>
       <w:lvlJc w:val="start"/>
       <w:pPr>
         <w:tabs>
@@ -1643,14 +2036,12 @@
         </w:tabs>
         <w:ind w:start="2836" w:hanging="283"/>
       </w:pPr>
-      <w:rPr>
-        <w:rFonts w:ascii="Symbol" w:hAnsi="Symbol" w:cs="Symbol" w:hint="default"/>
-      </w:rPr>
+      <w:rPr/>
     </w:lvl>
     <w:lvl w:ilvl="4">
       <w:start w:val="1"/>
-      <w:numFmt w:val="bullet"/>
-      <w:lvlText w:val=""/>
+      <w:numFmt w:val="decimal"/>
+      <w:lvlText w:val="%5."/>
       <w:lvlJc w:val="start"/>
       <w:pPr>
         <w:tabs>
@@ -1658,14 +2049,12 @@
         </w:tabs>
         <w:ind w:start="3545" w:hanging="283"/>
       </w:pPr>
-      <w:rPr>
-        <w:rFonts w:ascii="Symbol" w:hAnsi="Symbol" w:cs="Symbol" w:hint="default"/>
-      </w:rPr>
+      <w:rPr/>
     </w:lvl>
     <w:lvl w:ilvl="5">
       <w:start w:val="1"/>
-      <w:numFmt w:val="bullet"/>
-      <w:lvlText w:val=""/>
+      <w:numFmt w:val="decimal"/>
+      <w:lvlText w:val="%6."/>
       <w:lvlJc w:val="start"/>
       <w:pPr>
         <w:tabs>
@@ -1673,14 +2062,12 @@
         </w:tabs>
         <w:ind w:start="4254" w:hanging="283"/>
       </w:pPr>
-      <w:rPr>
-        <w:rFonts w:ascii="Symbol" w:hAnsi="Symbol" w:cs="Symbol" w:hint="default"/>
-      </w:rPr>
+      <w:rPr/>
     </w:lvl>
     <w:lvl w:ilvl="6">
       <w:start w:val="1"/>
-      <w:numFmt w:val="bullet"/>
-      <w:lvlText w:val=""/>
+      <w:numFmt w:val="decimal"/>
+      <w:lvlText w:val="%7."/>
       <w:lvlJc w:val="start"/>
       <w:pPr>
         <w:tabs>
@@ -1688,14 +2075,12 @@
         </w:tabs>
         <w:ind w:start="4963" w:hanging="283"/>
       </w:pPr>
-      <w:rPr>
-        <w:rFonts w:ascii="Symbol" w:hAnsi="Symbol" w:cs="Symbol" w:hint="default"/>
-      </w:rPr>
+      <w:rPr/>
     </w:lvl>
     <w:lvl w:ilvl="7">
       <w:start w:val="1"/>
-      <w:numFmt w:val="bullet"/>
-      <w:lvlText w:val=""/>
+      <w:numFmt w:val="decimal"/>
+      <w:lvlText w:val="%8."/>
       <w:lvlJc w:val="start"/>
       <w:pPr>
         <w:tabs>
@@ -1703,14 +2088,12 @@
         </w:tabs>
         <w:ind w:start="5672" w:hanging="283"/>
       </w:pPr>
-      <w:rPr>
-        <w:rFonts w:ascii="Symbol" w:hAnsi="Symbol" w:cs="Symbol" w:hint="default"/>
-      </w:rPr>
+      <w:rPr/>
     </w:lvl>
     <w:lvl w:ilvl="8">
       <w:start w:val="1"/>
-      <w:numFmt w:val="bullet"/>
-      <w:lvlText w:val=""/>
+      <w:numFmt w:val="decimal"/>
+      <w:lvlText w:val="%9."/>
       <w:lvlJc w:val="start"/>
       <w:pPr>
         <w:tabs>
@@ -1718,15 +2101,149 @@
         </w:tabs>
         <w:ind w:start="6381" w:hanging="283"/>
       </w:pPr>
-      <w:rPr>
-        <w:rFonts w:ascii="Symbol" w:hAnsi="Symbol" w:cs="Symbol" w:hint="default"/>
-      </w:rPr>
+      <w:rPr/>
     </w:lvl>
   </w:abstractNum>
   <w:abstractNum w:abstractNumId="6">
     <w:lvl w:ilvl="0">
       <w:start w:val="1"/>
-      <w:pStyle w:val="Heading1"/>
+      <w:numFmt w:val="bullet"/>
+      <w:lvlText w:val=""/>
+      <w:lvlJc w:val="start"/>
+      <w:pPr>
+        <w:tabs>
+          <w:tab w:val="num" w:pos="709"/>
+        </w:tabs>
+        <w:ind w:start="709" w:hanging="283"/>
+      </w:pPr>
+      <w:rPr>
+        <w:rFonts w:ascii="Symbol" w:hAnsi="Symbol" w:cs="Symbol" w:hint="default"/>
+      </w:rPr>
+    </w:lvl>
+    <w:lvl w:ilvl="1">
+      <w:start w:val="1"/>
+      <w:numFmt w:val="bullet"/>
+      <w:lvlText w:val=""/>
+      <w:lvlJc w:val="start"/>
+      <w:pPr>
+        <w:tabs>
+          <w:tab w:val="num" w:pos="1418"/>
+        </w:tabs>
+        <w:ind w:start="1418" w:hanging="283"/>
+      </w:pPr>
+      <w:rPr>
+        <w:rFonts w:ascii="Symbol" w:hAnsi="Symbol" w:cs="Symbol" w:hint="default"/>
+      </w:rPr>
+    </w:lvl>
+    <w:lvl w:ilvl="2">
+      <w:start w:val="1"/>
+      <w:numFmt w:val="bullet"/>
+      <w:lvlText w:val=""/>
+      <w:lvlJc w:val="start"/>
+      <w:pPr>
+        <w:tabs>
+          <w:tab w:val="num" w:pos="2127"/>
+        </w:tabs>
+        <w:ind w:start="2127" w:hanging="283"/>
+      </w:pPr>
+      <w:rPr>
+        <w:rFonts w:ascii="Symbol" w:hAnsi="Symbol" w:cs="Symbol" w:hint="default"/>
+      </w:rPr>
+    </w:lvl>
+    <w:lvl w:ilvl="3">
+      <w:start w:val="1"/>
+      <w:numFmt w:val="bullet"/>
+      <w:lvlText w:val=""/>
+      <w:lvlJc w:val="start"/>
+      <w:pPr>
+        <w:tabs>
+          <w:tab w:val="num" w:pos="2836"/>
+        </w:tabs>
+        <w:ind w:start="2836" w:hanging="283"/>
+      </w:pPr>
+      <w:rPr>
+        <w:rFonts w:ascii="Symbol" w:hAnsi="Symbol" w:cs="Symbol" w:hint="default"/>
+      </w:rPr>
+    </w:lvl>
+    <w:lvl w:ilvl="4">
+      <w:start w:val="1"/>
+      <w:numFmt w:val="bullet"/>
+      <w:lvlText w:val=""/>
+      <w:lvlJc w:val="start"/>
+      <w:pPr>
+        <w:tabs>
+          <w:tab w:val="num" w:pos="3545"/>
+        </w:tabs>
+        <w:ind w:start="3545" w:hanging="283"/>
+      </w:pPr>
+      <w:rPr>
+        <w:rFonts w:ascii="Symbol" w:hAnsi="Symbol" w:cs="Symbol" w:hint="default"/>
+      </w:rPr>
+    </w:lvl>
+    <w:lvl w:ilvl="5">
+      <w:start w:val="1"/>
+      <w:numFmt w:val="bullet"/>
+      <w:lvlText w:val=""/>
+      <w:lvlJc w:val="start"/>
+      <w:pPr>
+        <w:tabs>
+          <w:tab w:val="num" w:pos="4254"/>
+        </w:tabs>
+        <w:ind w:start="4254" w:hanging="283"/>
+      </w:pPr>
+      <w:rPr>
+        <w:rFonts w:ascii="Symbol" w:hAnsi="Symbol" w:cs="Symbol" w:hint="default"/>
+      </w:rPr>
+    </w:lvl>
+    <w:lvl w:ilvl="6">
+      <w:start w:val="1"/>
+      <w:numFmt w:val="bullet"/>
+      <w:lvlText w:val=""/>
+      <w:lvlJc w:val="start"/>
+      <w:pPr>
+        <w:tabs>
+          <w:tab w:val="num" w:pos="4963"/>
+        </w:tabs>
+        <w:ind w:start="4963" w:hanging="283"/>
+      </w:pPr>
+      <w:rPr>
+        <w:rFonts w:ascii="Symbol" w:hAnsi="Symbol" w:cs="Symbol" w:hint="default"/>
+      </w:rPr>
+    </w:lvl>
+    <w:lvl w:ilvl="7">
+      <w:start w:val="1"/>
+      <w:numFmt w:val="bullet"/>
+      <w:lvlText w:val=""/>
+      <w:lvlJc w:val="start"/>
+      <w:pPr>
+        <w:tabs>
+          <w:tab w:val="num" w:pos="5672"/>
+        </w:tabs>
+        <w:ind w:start="5672" w:hanging="283"/>
+      </w:pPr>
+      <w:rPr>
+        <w:rFonts w:ascii="Symbol" w:hAnsi="Symbol" w:cs="Symbol" w:hint="default"/>
+      </w:rPr>
+    </w:lvl>
+    <w:lvl w:ilvl="8">
+      <w:start w:val="1"/>
+      <w:numFmt w:val="bullet"/>
+      <w:lvlText w:val=""/>
+      <w:lvlJc w:val="start"/>
+      <w:pPr>
+        <w:tabs>
+          <w:tab w:val="num" w:pos="6381"/>
+        </w:tabs>
+        <w:ind w:start="6381" w:hanging="283"/>
+      </w:pPr>
+      <w:rPr>
+        <w:rFonts w:ascii="Symbol" w:hAnsi="Symbol" w:cs="Symbol" w:hint="default"/>
+      </w:rPr>
+    </w:lvl>
+  </w:abstractNum>
+  <w:abstractNum w:abstractNumId="7">
+    <w:lvl w:ilvl="0">
+      <w:start w:val="1"/>
       <w:numFmt w:val="none"/>
       <w:suff w:val="nothing"/>
       <w:lvlText w:val=""/>
@@ -1740,7 +2257,6 @@
     </w:lvl>
     <w:lvl w:ilvl="1">
       <w:start w:val="1"/>
-      <w:pStyle w:val="Heading2"/>
       <w:numFmt w:val="none"/>
       <w:suff w:val="nothing"/>
       <w:lvlText w:val=""/>
@@ -1754,7 +2270,6 @@
     </w:lvl>
     <w:lvl w:ilvl="2">
       <w:start w:val="1"/>
-      <w:pStyle w:val="Heading3"/>
       <w:numFmt w:val="none"/>
       <w:suff w:val="nothing"/>
       <w:lvlText w:val=""/>
@@ -1863,6 +2378,9 @@
   <w:num w:numId="6">
     <w:abstractNumId w:val="6"/>
   </w:num>
+  <w:num w:numId="7">
+    <w:abstractNumId w:val="7"/>
+  </w:num>
 </w:numbering>
 </file>
 
@@ -1880,7 +2398,6 @@
     </w:rPrDefault>
     <w:pPrDefault>
       <w:pPr>
-        <w:widowControl/>
         <w:suppressAutoHyphens w:val="true"/>
       </w:pPr>
     </w:pPrDefault>
@@ -1890,7 +2407,10 @@
     <w:qFormat/>
     <w:pPr>
       <w:widowControl/>
+      <w:suppressAutoHyphens w:val="true"/>
       <w:bidi w:val="0"/>
+      <w:spacing w:before="0" w:after="0"/>
+      <w:jc w:val="start"/>
     </w:pPr>
     <w:rPr>
       <w:rFonts w:ascii="Liberation Serif" w:hAnsi="Liberation Serif" w:eastAsia="NSimSun" w:cs="Lucida Sans"/>
@@ -1903,7 +2423,7 @@
   </w:style>
   <w:style w:type="paragraph" w:styleId="Heading1">
     <w:name w:val="heading 1"/>
-    <w:basedOn w:val="Ttulo"/>
+    <w:basedOn w:val="Ttulouser"/>
     <w:next w:val="BodyText"/>
     <w:qFormat/>
     <w:pPr>
@@ -1920,7 +2440,7 @@
   </w:style>
   <w:style w:type="paragraph" w:styleId="Heading2">
     <w:name w:val="heading 2"/>
-    <w:basedOn w:val="Ttulo"/>
+    <w:basedOn w:val="Ttulouser"/>
     <w:next w:val="BodyText"/>
     <w:qFormat/>
     <w:pPr>
@@ -1937,7 +2457,7 @@
   </w:style>
   <w:style w:type="paragraph" w:styleId="Heading3">
     <w:name w:val="heading 3"/>
-    <w:basedOn w:val="Ttulo"/>
+    <w:basedOn w:val="Ttulouser"/>
     <w:next w:val="BodyText"/>
     <w:qFormat/>
     <w:pPr>
@@ -1960,6 +2480,30 @@
       <w:bCs/>
     </w:rPr>
   </w:style>
+  <w:style w:type="character" w:styleId="Marcadoresuser">
+    <w:name w:val="Marcadores (user)"/>
+    <w:qFormat/>
+    <w:rPr>
+      <w:rFonts w:ascii="OpenSymbol" w:hAnsi="OpenSymbol" w:eastAsia="OpenSymbol" w:cs="OpenSymbol"/>
+    </w:rPr>
+  </w:style>
+  <w:style w:type="character" w:styleId="Cdigo-fonteuser">
+    <w:name w:val="Código-fonte (user)"/>
+    <w:qFormat/>
+    <w:rPr>
+      <w:rFonts w:ascii="Liberation Mono" w:hAnsi="Liberation Mono" w:eastAsia="NSimSun" w:cs="Liberation Mono"/>
+    </w:rPr>
+  </w:style>
+  <w:style w:type="character" w:styleId="Smbolosdenumeraouser">
+    <w:name w:val="Símbolos de numeração (user)"/>
+    <w:qFormat/>
+    <w:rPr/>
+  </w:style>
+  <w:style w:type="character" w:styleId="Smbolosdenumerao">
+    <w:name w:val="Símbolos de numeração"/>
+    <w:qFormat/>
+    <w:rPr/>
+  </w:style>
   <w:style w:type="character" w:styleId="Marcadores">
     <w:name w:val="Marcadores"/>
     <w:qFormat/>
@@ -1973,11 +2517,6 @@
     <w:rPr>
       <w:rFonts w:ascii="Liberation Mono" w:hAnsi="Liberation Mono" w:eastAsia="NSimSun" w:cs="Liberation Mono"/>
     </w:rPr>
-  </w:style>
-  <w:style w:type="character" w:styleId="Smbolosdenumerao">
-    <w:name w:val="Símbolos de numeração"/>
-    <w:qFormat/>
-    <w:rPr/>
   </w:style>
   <w:style w:type="paragraph" w:styleId="Ttulo">
     <w:name w:val="Título"/>
@@ -2035,6 +2574,45 @@
     </w:pPr>
     <w:rPr>
       <w:rFonts w:cs="Lucida Sans"/>
+    </w:rPr>
+  </w:style>
+  <w:style w:type="paragraph" w:styleId="Ttulouser">
+    <w:name w:val="Título (user)"/>
+    <w:basedOn w:val="Normal"/>
+    <w:next w:val="BodyText"/>
+    <w:qFormat/>
+    <w:pPr>
+      <w:keepNext w:val="true"/>
+      <w:spacing w:before="240" w:after="120"/>
+    </w:pPr>
+    <w:rPr>
+      <w:rFonts w:ascii="Liberation Sans" w:hAnsi="Liberation Sans" w:eastAsia="Microsoft YaHei" w:cs="Lucida Sans"/>
+      <w:sz w:val="28"/>
+      <w:szCs w:val="28"/>
+    </w:rPr>
+  </w:style>
+  <w:style w:type="paragraph" w:styleId="ndiceuser">
+    <w:name w:val="Índice (user)"/>
+    <w:basedOn w:val="Normal"/>
+    <w:qFormat/>
+    <w:pPr>
+      <w:suppressLineNumbers/>
+    </w:pPr>
+    <w:rPr>
+      <w:rFonts w:cs="Lucida Sans"/>
+    </w:rPr>
+  </w:style>
+  <w:style w:type="paragraph" w:styleId="Textoprformatadouser">
+    <w:name w:val="Texto préformatado (user)"/>
+    <w:basedOn w:val="Normal"/>
+    <w:qFormat/>
+    <w:pPr>
+      <w:spacing w:before="0" w:after="0"/>
+    </w:pPr>
+    <w:rPr>
+      <w:rFonts w:ascii="Liberation Mono" w:hAnsi="Liberation Mono" w:eastAsia="NSimSun" w:cs="Liberation Mono"/>
+      <w:sz w:val="20"/>
+      <w:szCs w:val="20"/>
     </w:rPr>
   </w:style>
   <w:style w:type="paragraph" w:styleId="Textoprformatado">

</xml_diff>